<commit_message>
Updates Layouts, Sales Order, Sales Invoice, Sales Quote
</commit_message>
<xml_diff>
--- a/src/Report/CommercialInvoice.docx
+++ b/src/Report/CommercialInvoice.docx
@@ -8874,7 +8874,9 @@
 <b:Sources xmlns:b="http://schemas.openxmlformats.org/officeDocument/2006/bibliography" xmlns="http://schemas.openxmlformats.org/officeDocument/2006/bibliography" SelectedStyle="\APASixthEditionOfficeOnline.xsl" StyleName="APA" Version="6"/>
 </file>
 
-<file path=customXml/item2.xml>��< ? x m l   v e r s i o n = " 1 . 0 "   e n c o d i n g = " u t f - 1 6 " ? > < N a v W o r d R e p o r t X m l P a r t   x m l n s = " u r n : m i c r o s o f t - d y n a m i c s - n a v / r e p o r t s / C o m m e r c i a l _ I n v o i c e / 5 4 1 0 0 / " > +<file path=customXml/item2.xml>��< ? x m l   v e r s i o n = " 1 . 0 "   e n c o d i n g = " u t f - 1 6 " ? > + 
+ < N a v W o r d R e p o r t X m l P a r t   x m l n s = " u r n : m i c r o s o f t - d y n a m i c s - n a v / r e p o r t s / C o m m e r c i a l _ I n v o i c e / 5 4 1 0 0 / " >   
      < H e a d e r >   
@@ -8920,7 +8922,7 @@
  
          < C o m p a n y P h o n e N o L b l > C o m p a n y P h o n e N o L b l < / C o m p a n y P h o n e N o L b l >   
-         < C o m p a n y P i c t u r e > C o m p a n y P i c t u r e < / C o m p a n y P i c t u r e > +         < C o m p a n y P i c t u r e   / >   
          < C o m p a n y V A T R e g N o > C o m p a n y V A T R e g N o < / C o m p a n y V A T R e g N o >   

</xml_diff>